<commit_message>
x-trusted-cluster: no new candidates; 1 trusted_signals refresh (Sansera Engineering)
Co-Authored-By: Claude Sonnet 5 <noreply@anthropic.com>
</commit_message>
<xml_diff>
--- a/projects/valuepickr-open-screen/docs/Sansera Engineering.docx
+++ b/projects/valuepickr-open-screen/docs/Sansera Engineering.docx
@@ -1292,6 +1292,62 @@
           <w:szCs w:val="20"/>
         </w:rPr>
         <w:t xml:space="preserve">No trusted-roster VP users posting. The amplification came via @ishmohit1 on X (user-named-trusted, 'core' cluster but floor stays phreakv6-only) highlighting the ADS un-executed order-book jump; treated as informational, not a floor. VP contributors divygupta, abhishek_sinha, santoshsingh, karanshah137 carried the substantive analysis.</w:t>
+      </w:r>
+    </w:p>
+    <w:p>
+      <w:pPr>
+        <w:pStyle w:val="Heading1"/>
+        <w:spacing w:after="120" w:before="280"/>
+      </w:pPr>
+      <w:r>
+        <w:t xml:space="preserve">Trusted-User Signals (Ongoing)</w:t>
+      </w:r>
+    </w:p>
+    <w:p>
+      <w:pPr>
+        <w:spacing w:after="120"/>
+      </w:pPr>
+      <w:r>
+        <w:rPr>
+          <w:i/>
+          <w:iCs/>
+          <w:color w:val="666666"/>
+          <w:sz w:val="18"/>
+          <w:szCs w:val="18"/>
+        </w:rPr>
+        <w:t xml:space="preserve">Every time a trusted user expresses clear conviction on this stock, most recent first — this section accumulates over time, it isn't a one-time snapshot.</w:t>
+      </w:r>
+    </w:p>
+    <w:p>
+      <w:pPr>
+        <w:spacing w:after="100"/>
+      </w:pPr>
+      <w:r>
+        <w:rPr>
+          <w:b/>
+          <w:bCs/>
+          <w:sz w:val="20"/>
+          <w:szCs w:val="20"/>
+        </w:rPr>
+        <w:t xml:space="preserve">2026-09-22 — LearningEleven (X)</w:t>
+      </w:r>
+      <w:r>
+        <w:rPr>
+          <w:i/>
+          <w:iCs/>
+          <w:color w:val="666666"/>
+          <w:sz w:val="18"/>
+          <w:szCs w:val="18"/>
+        </w:rPr>
+        <w:t xml:space="preserve"> (X / @LearningEleven)</w:t>
+      </w:r>
+      <w:r>
+        <w:rPr>
+          <w:sz w:val="20"/>
+          <w:szCs w:val="20"/>
+        </w:rPr>
+        <w:br/>
+        <w:t xml:space="preserve">: Going by intl brokerage coverage + price action, FAI went well &amp; more traction on semiconductor segment</w:t>
       </w:r>
     </w:p>
     <w:p>

</xml_diff>